<commit_message>
docx md pdf updated
</commit_message>
<xml_diff>
--- a/PSDS3121_Compendium_Dating2046_Wetherby_Aslanian_Yossem-Guy_Shi.docx
+++ b/PSDS3121_Compendium_Dating2046_Wetherby_Aslanian_Yossem-Guy_Shi.docx
@@ -6342,7 +6342,7 @@
         <w:t xml:space="preserve"> </w:t>
       </w:r>
       <w:r>
-        <w:t xml:space="preserve">(Appfigures 2025) is the observable current trend that closes the technical gap: by 2030 the user-side behavior — daily intimate routines with conversational agents — already exists. Connection Club is what happens when those six forces are run forward together under a Projected-cone regulatory regime.</w:t>
+        <w:t xml:space="preserve">(Appfigures 2025) is the observable current trend that closes the technical gap: by 2030 the user-side behavior — daily intimate routines with conversational agents — already exists. Connection Club is what happens when those six forces are run forward together under the Preposterous cone’s post-Companion Wars regulatory regime.</w:t>
       </w:r>
     </w:p>
     <w:p>
@@ -7562,7 +7562,7 @@
         <w:pStyle w:val="FirstParagraph"/>
       </w:pPr>
       <w:r>
-        <w:t xml:space="preserve">Group worked synchronously across Sprint 1 (in-class) and asynchronously across Sprint 2 with multiple live check-ins. Research responsibilities were divided by STEEP dimension; scenario writing and artifact design were collaborative. The artifact (Connection Club) was built in React based on a Figma design and iteratively refined to align with the projected-cone scenario.</w:t>
+        <w:t xml:space="preserve">Group worked synchronously across Sprint 1 (in-class) and asynchronously across Sprint 2 with multiple live check-ins. Research responsibilities were divided by STEEP dimension; scenario writing and artifact design were collaborative. The artifact (Connection Club) was built in React based on a Figma design and iteratively refined to align with the Preposterous cone scenario.</w:t>
       </w:r>
     </w:p>
     <w:p>

</xml_diff>

<commit_message>
docx md pdf updated 2nd ite
</commit_message>
<xml_diff>
--- a/PSDS3121_Compendium_Dating2046_Wetherby_Aslanian_Yossem-Guy_Shi.docx
+++ b/PSDS3121_Compendium_Dating2046_Wetherby_Aslanian_Yossem-Guy_Shi.docx
@@ -2862,23 +2862,7 @@
         <w:t xml:space="preserve"> </w:t>
       </w:r>
       <w:r>
-        <w:t xml:space="preserve">-</w:t>
-      </w:r>
-      <w:r>
-        <w:t xml:space="preserve"> </w:t>
-      </w:r>
-      <w:r>
-        <w:rPr>
-          <w:b/>
-          <w:bCs/>
-        </w:rPr>
-        <w:t xml:space="preserve">Aviation budget pressure:</w:t>
-      </w:r>
-      <w:r>
-        <w:t xml:space="preserve"> </w:t>
-      </w:r>
-      <w:r>
-        <w:t xml:space="preserve">long-haul air services consume a disproportionate share of the 1.5 °C carbon budget (Plucinska 2025; Dobruszkes, Mattioli, and Gozzoli 2024), making cross-regional intimacy a contested climate-policy variable rather than a free background condition.</w:t>
+        <w:t xml:space="preserve">- Aviation budget pressure: long-haul air services consume a disproportionate share of the 1.5 °C carbon budget (Plucinska 2025; Dobruszkes, Mattioli, and Gozzoli 2024; Xue, Chen, and Yu 2025), making cross-regional intimacy a contested climate-policy variable rather than a free background condition.</w:t>
       </w:r>
     </w:p>
     <w:p>
@@ -4017,7 +4001,7 @@
         <w:pStyle w:val="BodyText"/>
       </w:pPr>
       <w:r>
-        <w:t xml:space="preserve">The wheel maps the driver across all three cones. The Connection Club artifact occupies the Preposterous branch, specifically the intersection of node 3 (stratification) and node 6 (aviation collapse + mediated cross-regional intimacy). Climate did not cause the stratification — climate forced the question, and the regulatory answer at each fork decides which cone the wheel resolves into.</w:t>
+        <w:t xml:space="preserve">The wheel maps the driver across all three cones. The Connection Club artifact occupies the Preposterous branch, specifically the intersection of node 3 (stratification) and node 6 (aviation collapse + mediated cross-regional intimacy). Although node 3 (stratification) appears in both Projected and Preposterous cones as a concept — gradient in the former, binary in the latter — the Connection Club artifact specifically instantiates its Preposterous form: the 12% regulated tier sitting above the 88% gray market. Climate did not cause the stratification — climate forced the question, and the regulatory answer at each fork decides which cone the wheel resolves into.</w:t>
       </w:r>
     </w:p>
     <w:bookmarkStart w:id="35" w:name="fig:wheel"/>
@@ -5985,7 +5969,7 @@
         <w:pStyle w:val="FirstParagraph"/>
       </w:pPr>
       <w:r>
-        <w:t xml:space="preserve">Connection Club is a members club designed to restore human connection in a world where political instability, climate constraint on outdoor mobility, and compressed work schedules have made in-person social life increasingly inaccessible (IPCC 2023; Plucinska 2025; Dobruszkes, Mattioli, and Gozzoli 2024). Members enter a physical facility, are placed into a private pod with a full sensory VR headset and haptic suit, and meet others — across the world, but only within their own region of residence — in immersive shared environments. Each user has a persistent avatar built from a full-body scan, updated on every visit. Each lived scenario — a Lisbon café, a Hokkaido onsen, a Tokyo rooftop — runs concurrently, switchable like tabs, with relationships and memories carrying across sessions.</w:t>
+        <w:t xml:space="preserve">Connection Club is a members club designed to restore human connection in a world where post-Companion Wars regulation on intimate AI, near-elimination of commercial aviation, and SSP3-7.0 climate constraint on outdoor mobility have made in-person social life increasingly inaccessible (IPCC 2023; Plucinska 2025; Dobruszkes, Mattioli, and Gozzoli 2024; Regulation 2024/1689, as extended). Members enter a physical facility, are placed into a private pod with a full sensory VR headset and haptic suit, and meet others — across the world, but only within their own region of residence — in immersive shared environments. Each user has a persistent avatar built from a full-body scan, updated on every visit. Each lived scenario — a Lisbon café, a Hokkaido onsen, a Tokyo rooftop — runs concurrently, switchable like tabs, with relationships and memories carrying across sessions.</w:t>
       </w:r>
     </w:p>
     <w:bookmarkEnd w:id="54"/>
@@ -6376,7 +6360,7 @@
         <w:pStyle w:val="FirstParagraph"/>
       </w:pPr>
       <w:r>
-        <w:t xml:space="preserve">The target audience is young to middle-aged adults (21–45) living in dense urban environments — people who are experiencing social isolation despite being constantly</w:t>
+        <w:t xml:space="preserve">The target audience is adults 35 and older living in dense urban environments — divorced, widowed, partnered-and-bored, or climate-displaced — experiencing social isolation despite being constantly</w:t>
       </w:r>
       <w:r>
         <w:t xml:space="preserve"> </w:t>
@@ -6388,7 +6372,7 @@
         <w:t xml:space="preserve"> </w:t>
       </w:r>
       <w:r>
-        <w:t xml:space="preserve">struggling to form meaningful in-person relationships, and feeling the effects of climate restrictions on travel and mobility. This audience is structurally consistent with the cohort data the Compendium documents: the urban share of the global population reaches 68% by 2050 with 90% of growth in Asian and African megacities (UN World Urbanization Prospects 2018); long-haul aviation contracts under climate-budget pressure (Plucinska 2025; Dobruszkes, Mattioli, and Gozzoli 2024); and IPCC AR6 flags mental-health burden from extreme heat and weather events with high confidence (IPCC 2023, SPM A.2.5).</w:t>
+        <w:t xml:space="preserve">struggling to form meaningful in-person relationships, and feeling the effects of climate restrictions on travel and mobility. This audience is structurally consistent with the cohort data the Compendium documents: long-haul aviation contracts under climate-budget pressure (Plucinska 2025; Dobruszkes, Mattioli, and Gozzoli 2024); IPCC AR6 flags mental-health burden from extreme heat and weather events with high confidence (IPCC 2023, SPM A.2.5); and in the post-Companion Wars regulated tier described in §2.3.3, licensed intimate-AI access concentrates in the EU and 47 aligned states with the income to afford it.</w:t>
       </w:r>
     </w:p>
     <w:bookmarkEnd w:id="62"/>
@@ -6524,13 +6508,13 @@
           <w:b/>
           <w:bCs/>
         </w:rPr>
-        <w:t xml:space="preserve">Disclosure (Brussels-aligned jurisdictions):</w:t>
-      </w:r>
-      <w:r>
-        <w:t xml:space="preserve"> </w:t>
-      </w:r>
-      <w:r>
-        <w:t xml:space="preserve">Every AI-mediated element — avatar smoothing, ambient NPCs, conversation prompts — is disclosed at the start of each session per Article 50 of Regulation 2024/1689. In non-aligned jurisdictions this disclosure is optional.</w:t>
+        <w:t xml:space="preserve">Disclosure:</w:t>
+      </w:r>
+      <w:r>
+        <w:t xml:space="preserve"> </w:t>
+      </w:r>
+      <w:r>
+        <w:t xml:space="preserve">Every AI-mediated element — avatar smoothing, ambient NPCs, conversation prompts — is disclosed at the start of each session under Article 50 of Regulation 2024/1689 and the post-Companion Wars Article 5(3) prohibition on engineered emotional dependency. Connection Club operates only in EU and aligned jurisdictions where these disclosures are mandatory; the gray-market alternative described in §2.3.3 operates outside this regulated channel.</w:t>
       </w:r>
     </w:p>
     <w:p>
@@ -6606,7 +6590,7 @@
         </w:numPr>
       </w:pPr>
       <w:r>
-        <w:t xml:space="preserve">Compressed work schedules leave little time for in-person social formation.</w:t>
+        <w:t xml:space="preserve">Elder-care burden and long dating lifespans compress time available for partner search (UN WPP 2024; §1.4.1).</w:t>
       </w:r>
     </w:p>
     <w:p>

</xml_diff>